<commit_message>
Roadmap: check boxes in front of every task, formatting otherwise untouched
An empty box before each big goal and each daily task (both the Jacob and
Owen halves of a shared line) so items can be ticked off; wording, bullets
and spacing stay exactly as the owner had them.

Co-Authored-By: Claude Fable 5 <noreply@anthropic.com>
Claude-Session: https://claude.ai/code/session_01CMy9s4BxYTwrhELM7kd8U2
</commit_message>
<xml_diff>
--- a/docs/Comp_Ninja_August_roadmap_completed.docx
+++ b/docs/Comp_Ninja_August_roadmap_completed.docx
@@ -49,7 +49,7 @@
         <w:rPr>
           <w:rtl w:val="0"/>
         </w:rPr>
-        <w:t xml:space="preserve">Finish and refine the enterprise system</w:t>
+        <w:t xml:space="preserve">☐ Finish and refine the enterprise system</w:t>
       </w:r>
     </w:p>
     <w:p>
@@ -67,7 +67,7 @@
         <w:rPr>
           <w:rtl w:val="0"/>
         </w:rPr>
-        <w:t xml:space="preserve">Add CompNinja to the App store and optimize it mobile </w:t>
+        <w:t xml:space="preserve">☐ Add CompNinja to the App store and optimize it mobile </w:t>
       </w:r>
     </w:p>
     <w:p>
@@ -85,7 +85,7 @@
         <w:rPr>
           <w:rtl w:val="0"/>
         </w:rPr>
-        <w:t xml:space="preserve">Create a desktop app</w:t>
+        <w:t xml:space="preserve">☐ Create a desktop app</w:t>
       </w:r>
     </w:p>
     <w:p>
@@ -103,7 +103,7 @@
         <w:rPr>
           <w:rtl w:val="0"/>
         </w:rPr>
-        <w:t xml:space="preserve">Redesign the website, to make everything more connected</w:t>
+        <w:t xml:space="preserve">☐ Redesign the website, to make everything more connected</w:t>
       </w:r>
     </w:p>
     <w:p>
@@ -121,7 +121,7 @@
         <w:rPr>
           <w:rtl w:val="0"/>
         </w:rPr>
-        <w:t xml:space="preserve">Increase search accuracy by 5%</w:t>
+        <w:t xml:space="preserve">☐ Increase search accuracy by 5%</w:t>
       </w:r>
     </w:p>
     <w:p>
@@ -171,25 +171,25 @@
         <w:rPr>
           <w:rtl w:val="0"/>
         </w:rPr>
-        <w:t xml:space="preserve">Create a desktop App                                 -    Make CompNinja an app on the app store</w:t>
-      </w:r>
-    </w:p>
-    <w:p>
-      <w:pPr>
-        <w:numPr>
-          <w:ilvl w:val="0"/>
-          <w:numId w:val="1"/>
-        </w:numPr>
-        <w:ind w:left="720" w:hanging="360"/>
-        <w:rPr>
-          <w:u w:val="none"/>
-        </w:rPr>
-      </w:pPr>
-      <w:r>
-        <w:rPr>
-          <w:rtl w:val="0"/>
-        </w:rPr>
-        <w:t xml:space="preserve">Organize CompNinjas UI                          - Add Expanding Flat and contracking areas in                                                                           </w:t>
+        <w:t xml:space="preserve">☐ Create a desktop App                                 -    ☐ Make CompNinja an app on the app store</w:t>
+      </w:r>
+    </w:p>
+    <w:p>
+      <w:pPr>
+        <w:numPr>
+          <w:ilvl w:val="0"/>
+          <w:numId w:val="1"/>
+        </w:numPr>
+        <w:ind w:left="720" w:hanging="360"/>
+        <w:rPr>
+          <w:u w:val="none"/>
+        </w:rPr>
+      </w:pPr>
+      <w:r>
+        <w:rPr>
+          <w:rtl w:val="0"/>
+        </w:rPr>
+        <w:t xml:space="preserve">☐ Organize CompNinjas UI                          - ☐ Add Expanding Flat and contracking areas in                                                                           </w:t>
       </w:r>
     </w:p>
     <w:p>
@@ -239,43 +239,43 @@
         <w:rPr>
           <w:rtl w:val="0"/>
         </w:rPr>
-        <w:t xml:space="preserve">Keep building the desktop app                   -    Keep working on the app store version</w:t>
-      </w:r>
-    </w:p>
-    <w:p>
-      <w:pPr>
-        <w:numPr>
-          <w:ilvl w:val="0"/>
-          <w:numId w:val="1"/>
-        </w:numPr>
-        <w:ind w:left="720" w:hanging="360"/>
-        <w:rPr>
-          <w:u w:val="none"/>
-        </w:rPr>
-      </w:pPr>
-      <w:r>
-        <w:rPr>
-          <w:rtl w:val="0"/>
-        </w:rPr>
-        <w:t xml:space="preserve">Start the website redesign</w:t>
-      </w:r>
-    </w:p>
-    <w:p>
-      <w:pPr>
-        <w:numPr>
-          <w:ilvl w:val="0"/>
-          <w:numId w:val="1"/>
-        </w:numPr>
-        <w:ind w:left="720" w:hanging="360"/>
-        <w:rPr>
-          <w:u w:val="none"/>
-        </w:rPr>
-      </w:pPr>
-      <w:r>
-        <w:rPr>
-          <w:rtl w:val="0"/>
-        </w:rPr>
-        <w:t xml:space="preserve">Test search accuracy</w:t>
+        <w:t xml:space="preserve">☐ Keep building the desktop app                   -    ☐ Keep working on the app store version</w:t>
+      </w:r>
+    </w:p>
+    <w:p>
+      <w:pPr>
+        <w:numPr>
+          <w:ilvl w:val="0"/>
+          <w:numId w:val="1"/>
+        </w:numPr>
+        <w:ind w:left="720" w:hanging="360"/>
+        <w:rPr>
+          <w:u w:val="none"/>
+        </w:rPr>
+      </w:pPr>
+      <w:r>
+        <w:rPr>
+          <w:rtl w:val="0"/>
+        </w:rPr>
+        <w:t xml:space="preserve">☐ Start the website redesign</w:t>
+      </w:r>
+    </w:p>
+    <w:p>
+      <w:pPr>
+        <w:numPr>
+          <w:ilvl w:val="0"/>
+          <w:numId w:val="1"/>
+        </w:numPr>
+        <w:ind w:left="720" w:hanging="360"/>
+        <w:rPr>
+          <w:u w:val="none"/>
+        </w:rPr>
+      </w:pPr>
+      <w:r>
+        <w:rPr>
+          <w:rtl w:val="0"/>
+        </w:rPr>
+        <w:t xml:space="preserve">☐ Test search accuracy</w:t>
       </w:r>
     </w:p>
     <w:p>
@@ -325,25 +325,25 @@
         <w:rPr>
           <w:rtl w:val="0"/>
         </w:rPr>
-        <w:t xml:space="preserve">Work on the desktop app                         -    Test the app on a phone</w:t>
-      </w:r>
-    </w:p>
-    <w:p>
-      <w:pPr>
-        <w:numPr>
-          <w:ilvl w:val="0"/>
-          <w:numId w:val="1"/>
-        </w:numPr>
-        <w:ind w:left="720" w:hanging="360"/>
-        <w:rPr>
-          <w:u w:val="none"/>
-        </w:rPr>
-      </w:pPr>
-      <w:r>
-        <w:rPr>
-          <w:rtl w:val="0"/>
-        </w:rPr>
-        <w:t xml:space="preserve">Clean up the website design</w:t>
+        <w:t xml:space="preserve">☐ Work on the desktop app                         -    ☐ Test the app on a phone</w:t>
+      </w:r>
+    </w:p>
+    <w:p>
+      <w:pPr>
+        <w:numPr>
+          <w:ilvl w:val="0"/>
+          <w:numId w:val="1"/>
+        </w:numPr>
+        <w:ind w:left="720" w:hanging="360"/>
+        <w:rPr>
+          <w:u w:val="none"/>
+        </w:rPr>
+      </w:pPr>
+      <w:r>
+        <w:rPr>
+          <w:rtl w:val="0"/>
+        </w:rPr>
+        <w:t xml:space="preserve">☐ Clean up the website design</w:t>
       </w:r>
     </w:p>
     <w:p>
@@ -393,25 +393,25 @@
         <w:rPr>
           <w:rtl w:val="0"/>
         </w:rPr>
-        <w:t xml:space="preserve">Website redesign mockups</w:t>
-      </w:r>
-    </w:p>
-    <w:p>
-      <w:pPr>
-        <w:numPr>
-          <w:ilvl w:val="0"/>
-          <w:numId w:val="1"/>
-        </w:numPr>
-        <w:ind w:left="720" w:hanging="360"/>
-        <w:rPr>
-          <w:u w:val="none"/>
-        </w:rPr>
-      </w:pPr>
-      <w:r>
-        <w:rPr>
-          <w:rtl w:val="0"/>
-        </w:rPr>
-        <w:t xml:space="preserve">Run search accuracy tests</w:t>
+        <w:t xml:space="preserve">☐ Website redesign mockups</w:t>
+      </w:r>
+    </w:p>
+    <w:p>
+      <w:pPr>
+        <w:numPr>
+          <w:ilvl w:val="0"/>
+          <w:numId w:val="1"/>
+        </w:numPr>
+        <w:ind w:left="720" w:hanging="360"/>
+        <w:rPr>
+          <w:u w:val="none"/>
+        </w:rPr>
+      </w:pPr>
+      <w:r>
+        <w:rPr>
+          <w:rtl w:val="0"/>
+        </w:rPr>
+        <w:t xml:space="preserve">☐ Run search accuracy tests</w:t>
       </w:r>
     </w:p>
     <w:p>
@@ -461,25 +461,25 @@
         <w:rPr>
           <w:rtl w:val="0"/>
         </w:rPr>
-        <w:t xml:space="preserve">Connect the website pages together              -    Get the app ready for the app store</w:t>
-      </w:r>
-    </w:p>
-    <w:p>
-      <w:pPr>
-        <w:numPr>
-          <w:ilvl w:val="0"/>
-          <w:numId w:val="1"/>
-        </w:numPr>
-        <w:ind w:left="720" w:hanging="360"/>
-        <w:rPr>
-          <w:u w:val="none"/>
-        </w:rPr>
-      </w:pPr>
-      <w:r>
-        <w:rPr>
-          <w:rtl w:val="0"/>
-        </w:rPr>
-        <w:t xml:space="preserve">Work on the enterprise system</w:t>
+        <w:t xml:space="preserve">☐ Connect the website pages together              -    ☐ Get the app ready for the app store</w:t>
+      </w:r>
+    </w:p>
+    <w:p>
+      <w:pPr>
+        <w:numPr>
+          <w:ilvl w:val="0"/>
+          <w:numId w:val="1"/>
+        </w:numPr>
+        <w:ind w:left="720" w:hanging="360"/>
+        <w:rPr>
+          <w:u w:val="none"/>
+        </w:rPr>
+      </w:pPr>
+      <w:r>
+        <w:rPr>
+          <w:rtl w:val="0"/>
+        </w:rPr>
+        <w:t xml:space="preserve">☐ Work on the enterprise system</w:t>
       </w:r>
     </w:p>
     <w:p>
@@ -529,43 +529,43 @@
         <w:rPr>
           <w:rtl w:val="0"/>
         </w:rPr>
-        <w:t xml:space="preserve">Finish the desktop app                          -    Make the site look good on mobile</w:t>
-      </w:r>
-    </w:p>
-    <w:p>
-      <w:pPr>
-        <w:numPr>
-          <w:ilvl w:val="0"/>
-          <w:numId w:val="1"/>
-        </w:numPr>
-        <w:ind w:left="720" w:hanging="360"/>
-        <w:rPr>
-          <w:u w:val="none"/>
-        </w:rPr>
-      </w:pPr>
-      <w:r>
-        <w:rPr>
-          <w:rtl w:val="0"/>
-        </w:rPr>
-        <w:t xml:space="preserve">Improve search accuracy</w:t>
-      </w:r>
-    </w:p>
-    <w:p>
-      <w:pPr>
-        <w:numPr>
-          <w:ilvl w:val="0"/>
-          <w:numId w:val="1"/>
-        </w:numPr>
-        <w:ind w:left="720" w:hanging="360"/>
-        <w:rPr>
-          <w:u w:val="none"/>
-        </w:rPr>
-      </w:pPr>
-      <w:r>
-        <w:rPr>
-          <w:rtl w:val="0"/>
-        </w:rPr>
-        <w:t xml:space="preserve">Test the enterprise system</w:t>
+        <w:t xml:space="preserve">☐ Finish the desktop app                          -    ☐ Make the site look good on mobile</w:t>
+      </w:r>
+    </w:p>
+    <w:p>
+      <w:pPr>
+        <w:numPr>
+          <w:ilvl w:val="0"/>
+          <w:numId w:val="1"/>
+        </w:numPr>
+        <w:ind w:left="720" w:hanging="360"/>
+        <w:rPr>
+          <w:u w:val="none"/>
+        </w:rPr>
+      </w:pPr>
+      <w:r>
+        <w:rPr>
+          <w:rtl w:val="0"/>
+        </w:rPr>
+        <w:t xml:space="preserve">☐ Improve search accuracy</w:t>
+      </w:r>
+    </w:p>
+    <w:p>
+      <w:pPr>
+        <w:numPr>
+          <w:ilvl w:val="0"/>
+          <w:numId w:val="1"/>
+        </w:numPr>
+        <w:ind w:left="720" w:hanging="360"/>
+        <w:rPr>
+          <w:u w:val="none"/>
+        </w:rPr>
+      </w:pPr>
+      <w:r>
+        <w:rPr>
+          <w:rtl w:val="0"/>
+        </w:rPr>
+        <w:t xml:space="preserve">☐ Test the enterprise system</w:t>
       </w:r>
     </w:p>
     <w:p>
@@ -615,25 +615,25 @@
         <w:rPr>
           <w:rtl w:val="0"/>
         </w:rPr>
-        <w:t xml:space="preserve">Fix bugs from testing                           -    Submit the app to the app store</w:t>
-      </w:r>
-    </w:p>
-    <w:p>
-      <w:pPr>
-        <w:numPr>
-          <w:ilvl w:val="0"/>
-          <w:numId w:val="1"/>
-        </w:numPr>
-        <w:ind w:left="720" w:hanging="360"/>
-        <w:rPr>
-          <w:u w:val="none"/>
-        </w:rPr>
-      </w:pPr>
-      <w:r>
-        <w:rPr>
-          <w:rtl w:val="0"/>
-        </w:rPr>
-        <w:t xml:space="preserve">Polish the website redesign</w:t>
+        <w:t xml:space="preserve">☐ Fix bugs from testing                           -    ☐ Submit the app to the app store</w:t>
+      </w:r>
+    </w:p>
+    <w:p>
+      <w:pPr>
+        <w:numPr>
+          <w:ilvl w:val="0"/>
+          <w:numId w:val="1"/>
+        </w:numPr>
+        <w:ind w:left="720" w:hanging="360"/>
+        <w:rPr>
+          <w:u w:val="none"/>
+        </w:rPr>
+      </w:pPr>
+      <w:r>
+        <w:rPr>
+          <w:rtl w:val="0"/>
+        </w:rPr>
+        <w:t xml:space="preserve">☐ Polish the website redesign</w:t>
       </w:r>
     </w:p>
     <w:p>
@@ -683,25 +683,25 @@
         <w:rPr>
           <w:rtl w:val="0"/>
         </w:rPr>
-        <w:t xml:space="preserve">Test everything                                 -    Fix app store feedback</w:t>
-      </w:r>
-    </w:p>
-    <w:p>
-      <w:pPr>
-        <w:numPr>
-          <w:ilvl w:val="0"/>
-          <w:numId w:val="1"/>
-        </w:numPr>
-        <w:ind w:left="720" w:hanging="360"/>
-        <w:rPr>
-          <w:u w:val="none"/>
-        </w:rPr>
-      </w:pPr>
-      <w:r>
-        <w:rPr>
-          <w:rtl w:val="0"/>
-        </w:rPr>
-        <w:t xml:space="preserve">Check search accuracy is up 5%</w:t>
+        <w:t xml:space="preserve">☐ Test everything                                 -    ☐ Fix app store feedback</w:t>
+      </w:r>
+    </w:p>
+    <w:p>
+      <w:pPr>
+        <w:numPr>
+          <w:ilvl w:val="0"/>
+          <w:numId w:val="1"/>
+        </w:numPr>
+        <w:ind w:left="720" w:hanging="360"/>
+        <w:rPr>
+          <w:u w:val="none"/>
+        </w:rPr>
+      </w:pPr>
+      <w:r>
+        <w:rPr>
+          <w:rtl w:val="0"/>
+        </w:rPr>
+        <w:t xml:space="preserve">☐ Check search accuracy is up 5%</w:t>
       </w:r>
     </w:p>
     <w:p>
@@ -751,25 +751,25 @@
         <w:rPr>
           <w:rtl w:val="0"/>
         </w:rPr>
-        <w:t xml:space="preserve">Launch everything                               -    Final mobile check</w:t>
-      </w:r>
-    </w:p>
-    <w:p>
-      <w:pPr>
-        <w:numPr>
-          <w:ilvl w:val="0"/>
-          <w:numId w:val="1"/>
-        </w:numPr>
-        <w:ind w:left="720" w:hanging="360"/>
-        <w:rPr>
-          <w:u w:val="none"/>
-        </w:rPr>
-      </w:pPr>
-      <w:r>
-        <w:rPr>
-          <w:rtl w:val="0"/>
-        </w:rPr>
-        <w:t xml:space="preserve">Review the big goals</w:t>
+        <w:t xml:space="preserve">☐ Launch everything                               -    ☐ Final mobile check</w:t>
+      </w:r>
+    </w:p>
+    <w:p>
+      <w:pPr>
+        <w:numPr>
+          <w:ilvl w:val="0"/>
+          <w:numId w:val="1"/>
+        </w:numPr>
+        <w:ind w:left="720" w:hanging="360"/>
+        <w:rPr>
+          <w:u w:val="none"/>
+        </w:rPr>
+      </w:pPr>
+      <w:r>
+        <w:rPr>
+          <w:rtl w:val="0"/>
+        </w:rPr>
+        <w:t xml:space="preserve">☐ Review the big goals</w:t>
       </w:r>
     </w:p>
     <w:sectPr>

</xml_diff>